<commit_message>
update README, TEAM_GUIDE and proposal.docx
</commit_message>
<xml_diff>
--- a/Project_VERA_Proposal.docx
+++ b/Project_VERA_Proposal.docx
@@ -490,7 +490,7 @@
         <w:pStyle w:val="ListBullet"/>
       </w:pPr>
       <w:r>
-        <w:t>Router Agent: Classifies query intent and performs RBAC security checks</w:t>
+        <w:t>Router Agent: Performs LLM-based NER and surgical routing to domain subchains</w:t>
       </w:r>
     </w:p>
     <w:p>
@@ -498,7 +498,7 @@
         <w:pStyle w:val="ListBullet"/>
       </w:pPr>
       <w:r>
-        <w:t>Technical Spec Agent: Retrieves and analyzes product datasheet information</w:t>
+        <w:t>DB Agent: Executes natural language to SQL queries on domain databases</w:t>
       </w:r>
     </w:p>
     <w:p>
@@ -506,7 +506,15 @@
         <w:pStyle w:val="ListBullet"/>
       </w:pPr>
       <w:r>
-        <w:t>Compliance Agent: Searches SOPs and internal emails for process information</w:t>
+        <w:t>Official Docs Agent: Extracts high-precision facts from datasheets and manuals</w:t>
+      </w:r>
+    </w:p>
+    <w:p>
+      <w:pPr>
+        <w:pStyle w:val="ListBullet"/>
+      </w:pPr>
+      <w:r>
+        <w:t>Informal Docs Agent: Researches engineering emails and informal memos</w:t>
       </w:r>
     </w:p>
     <w:p>
@@ -522,7 +530,7 @@
         <w:pStyle w:val="ListBullet"/>
       </w:pPr>
       <w:r>
-        <w:t>Case Agent: Detects and reports discrepancies across document sources</w:t>
+        <w:t>Discrepancy Agent: Performs final audit and cross-source conflict detection</w:t>
       </w:r>
     </w:p>
     <w:p>
@@ -530,7 +538,7 @@
         <w:pStyle w:val="ListBullet"/>
       </w:pPr>
       <w:r>
-        <w:t>Escalation Handler: Manages unauthorized access attempts</w:t>
+        <w:t>Escalation Handler: Manages unauthorized access and out-of-domain queries</w:t>
       </w:r>
     </w:p>
     <w:p>
@@ -658,7 +666,7 @@
           </w:tcPr>
           <w:p>
             <w:r>
-              <w:t>Classifies intent + security check</w:t>
+              <w:t>LLM-NER (Entity/Attr) + Surgical Routing</w:t>
             </w:r>
           </w:p>
         </w:tc>
@@ -680,7 +688,7 @@
           </w:tcPr>
           <w:p>
             <w:r>
-              <w:t>Tech Spec Agent</w:t>
+              <w:t>DB Agent</w:t>
             </w:r>
           </w:p>
         </w:tc>
@@ -690,7 +698,7 @@
           </w:tcPr>
           <w:p>
             <w:r>
-              <w:t>Retrieves from datasheets (if technical)</w:t>
+              <w:t>SQL Querying (Read-only) if db_query target</w:t>
             </w:r>
           </w:p>
         </w:tc>
@@ -712,7 +720,7 @@
           </w:tcPr>
           <w:p>
             <w:r>
-              <w:t>Compliance Agent</w:t>
+              <w:t>Official Agent</w:t>
             </w:r>
           </w:p>
         </w:tc>
@@ -722,7 +730,7 @@
           </w:tcPr>
           <w:p>
             <w:r>
-              <w:t>Retrieves from SOPs + emails (if compliance)</w:t>
+              <w:t>Spec Extraction if spec_retrieval target</w:t>
             </w:r>
           </w:p>
         </w:tc>
@@ -744,7 +752,7 @@
           </w:tcPr>
           <w:p>
             <w:r>
-              <w:t>Escalation</w:t>
+              <w:t>Full Retrieval</w:t>
             </w:r>
           </w:p>
         </w:tc>
@@ -754,7 +762,7 @@
           </w:tcPr>
           <w:p>
             <w:r>
-              <w:t>Handles unauthorized access (if flagged)</w:t>
+              <w:t>Cross-referencing all sources if cross_reference</w:t>
             </w:r>
           </w:p>
         </w:tc>
@@ -776,7 +784,7 @@
           </w:tcPr>
           <w:p>
             <w:r>
-              <w:t>Generator + Case Agent</w:t>
+              <w:t>Generator + Auditor</w:t>
             </w:r>
           </w:p>
         </w:tc>
@@ -786,7 +794,7 @@
           </w:tcPr>
           <w:p>
             <w:r>
-              <w:t>Synthesizes response + checks discrepancies</w:t>
+              <w:t>Response synthesis + Discrepancy audit</w:t>
             </w:r>
           </w:p>
         </w:tc>
@@ -904,7 +912,7 @@
           </w:tcPr>
           <w:p>
             <w:r>
-              <w:t>Question + User Role</w:t>
+              <w:t>Question + Role</w:t>
             </w:r>
           </w:p>
         </w:tc>
@@ -914,7 +922,7 @@
           </w:tcPr>
           <w:p>
             <w:r>
-              <w:t>Route + Security Flag</w:t>
+              <w:t>Route + NER + Security Flag</w:t>
             </w:r>
           </w:p>
         </w:tc>
@@ -926,7 +934,7 @@
           </w:tcPr>
           <w:p>
             <w:r>
-              <w:t>Tech Spec</w:t>
+              <w:t>DB Agent</w:t>
             </w:r>
           </w:p>
         </w:tc>
@@ -936,7 +944,7 @@
           </w:tcPr>
           <w:p>
             <w:r>
-              <w:t>retrieve_specs</w:t>
+              <w:t>{domain}_db_query</w:t>
             </w:r>
           </w:p>
         </w:tc>
@@ -956,7 +964,7 @@
           </w:tcPr>
           <w:p>
             <w:r>
-              <w:t>Datasheet Documents</w:t>
+              <w:t>SQL Results as Structured Facts</w:t>
             </w:r>
           </w:p>
         </w:tc>
@@ -968,7 +976,7 @@
           </w:tcPr>
           <w:p>
             <w:r>
-              <w:t>Compliance</w:t>
+              <w:t>Official Docs</w:t>
             </w:r>
           </w:p>
         </w:tc>
@@ -978,7 +986,7 @@
           </w:tcPr>
           <w:p>
             <w:r>
-              <w:t>retrieve_compliance</w:t>
+              <w:t>{domain}_official</w:t>
             </w:r>
           </w:p>
         </w:tc>
@@ -988,7 +996,7 @@
           </w:tcPr>
           <w:p>
             <w:r>
-              <w:t>Question</w:t>
+              <w:t>Question + Entity</w:t>
             </w:r>
           </w:p>
         </w:tc>
@@ -998,7 +1006,49 @@
           </w:tcPr>
           <w:p>
             <w:r>
-              <w:t>SOP + Email Documents</w:t>
+              <w:t>Precise Specifications</w:t>
+            </w:r>
+          </w:p>
+        </w:tc>
+      </w:tr>
+      <w:tr>
+        <w:tc>
+          <w:tcPr>
+            <w:tcW w:type="dxa" w:w="2160"/>
+          </w:tcPr>
+          <w:p>
+            <w:r>
+              <w:t>Informal Docs</w:t>
+            </w:r>
+          </w:p>
+        </w:tc>
+        <w:tc>
+          <w:tcPr>
+            <w:tcW w:type="dxa" w:w="2160"/>
+          </w:tcPr>
+          <w:p>
+            <w:r>
+              <w:t>{domain}_informal</w:t>
+            </w:r>
+          </w:p>
+        </w:tc>
+        <w:tc>
+          <w:tcPr>
+            <w:tcW w:type="dxa" w:w="2160"/>
+          </w:tcPr>
+          <w:p>
+            <w:r>
+              <w:t>Question + Entity</w:t>
+            </w:r>
+          </w:p>
+        </w:tc>
+        <w:tc>
+          <w:tcPr>
+            <w:tcW w:type="dxa" w:w="2160"/>
+          </w:tcPr>
+          <w:p>
+            <w:r>
+              <w:t>Email-based Decisions</w:t>
             </w:r>
           </w:p>
         </w:tc>
@@ -1030,7 +1080,7 @@
           </w:tcPr>
           <w:p>
             <w:r>
-              <w:t>Documents + Question</w:t>
+              <w:t>Extracted Facts</w:t>
             </w:r>
           </w:p>
         </w:tc>
@@ -1040,7 +1090,7 @@
           </w:tcPr>
           <w:p>
             <w:r>
-              <w:t>LLM Response</w:t>
+              <w:t>LLM Report</w:t>
             </w:r>
           </w:p>
         </w:tc>
@@ -1052,7 +1102,7 @@
           </w:tcPr>
           <w:p>
             <w:r>
-              <w:t>Case Agent</w:t>
+              <w:t>Discrepancy</w:t>
             </w:r>
           </w:p>
         </w:tc>
@@ -1062,7 +1112,7 @@
           </w:tcPr>
           <w:p>
             <w:r>
-              <w:t>check_discrepancy</w:t>
+              <w:t>{domain}_discrepancy</w:t>
             </w:r>
           </w:p>
         </w:tc>
@@ -1072,7 +1122,7 @@
           </w:tcPr>
           <w:p>
             <w:r>
-              <w:t>Documents + Response</w:t>
+              <w:t>All Facts + Report</w:t>
             </w:r>
           </w:p>
         </w:tc>
@@ -1082,49 +1132,7 @@
           </w:tcPr>
           <w:p>
             <w:r>
-              <w:t>Discrepancy Report</w:t>
-            </w:r>
-          </w:p>
-        </w:tc>
-      </w:tr>
-      <w:tr>
-        <w:tc>
-          <w:tcPr>
-            <w:tcW w:type="dxa" w:w="2160"/>
-          </w:tcPr>
-          <w:p>
-            <w:r>
-              <w:t>Escalation</w:t>
-            </w:r>
-          </w:p>
-        </w:tc>
-        <w:tc>
-          <w:tcPr>
-            <w:tcW w:type="dxa" w:w="2160"/>
-          </w:tcPr>
-          <w:p>
-            <w:r>
-              <w:t>escalate</w:t>
-            </w:r>
-          </w:p>
-        </w:tc>
-        <w:tc>
-          <w:tcPr>
-            <w:tcW w:type="dxa" w:w="2160"/>
-          </w:tcPr>
-          <w:p>
-            <w:r>
-              <w:t>Security Flag</w:t>
-            </w:r>
-          </w:p>
-        </w:tc>
-        <w:tc>
-          <w:tcPr>
-            <w:tcW w:type="dxa" w:w="2160"/>
-          </w:tcPr>
-          <w:p>
-            <w:r>
-              <w:t>Escalation Notice</w:t>
+              <w:t>Audit Verdict</w:t>
             </w:r>
           </w:p>
         </w:tc>

</xml_diff>